<commit_message>
Correct showcase financial labels and sharpen evidence boundaries
Refresh real Nexus captures and synthetic inputs. Make the founder's product judgment explicit and describe orchestration without publishing private source contracts or verification results.

Co-Authored-By: GPT-6 <noreply@openai.com>
Agent-Role: builder
Agent-Run: main
</commit_message>
<xml_diff>
--- a/assets/demo/northstar-pilot-decision.docx
+++ b/assets/demo/northstar-pilot-decision.docx
@@ -28,7 +28,7 @@
     </w:p>
     <w:p>
       <w:r>
-        <w:t xml:space="preserve">Run a five-site pilot before committing to 20 sites. The full-scale base case produces $120,000 in monthly contribution. An increase in direct costs from 62% to 70% of revenue reduces contribution to $40,000, with volume and price held constant.</w:t>
+        <w:t xml:space="preserve">Run a five-site pilot before committing to 20 sites. The full-scale base case produces $120,000 in monthly operating surplus. An increase in direct costs from 62% to 70% of revenue reduces operating surplus to $40,000, with volume and price held constant.</w:t>
       </w:r>
     </w:p>
     <w:p>
@@ -41,7 +41,7 @@
     </w:p>
     <w:p>
       <w:r>
-        <w:t xml:space="preserve">The model assumes 20 sites, 100 monthly visits per site and $500 revenue per visit. Monthly revenue is $1,000,000. Fixed monthly cost is $260,000. The model calculates direct costs, contribution and the $80,000 downside exposure.</w:t>
+        <w:t xml:space="preserve">The model assumes 20 sites, 100 monthly visits per site and $500 revenue per visit. Monthly revenue is $1,000,000. Fixed monthly cost is $260,000. The model calculates direct costs, operating surplus and the $80,000 downside exposure.</w:t>
       </w:r>
     </w:p>
     <w:p>

</xml_diff>